<commit_message>
Add fixed Q3 screenshots to Experiment 3 submission document
Co-Authored-By: Claude Opus 5.5 <noreply@anthropic.com>
Claude-Session: https://claude.ai/code/session_01AEpijYRL5yYf8piu39phkP
</commit_message>
<xml_diff>
--- a/exp3/Exp3_Assignment.docx
+++ b/exp3/Exp3_Assignment.docx
@@ -62,7 +62,7 @@
         </w:rPr>
         <w:t xml:space="preserve">Ans: Link1: </w:t>
       </w:r>
-      <w:hyperlink w:history="1" r:id="rIde62hkfnlg40-g3lpo5ljf">
+      <w:hyperlink w:history="1" r:id="rId0k5rpl7s_3bgtkkydgrry">
         <w:r>
           <w:rPr>
             <w:rStyle w:val="Hyperlink"/>
@@ -214,7 +214,7 @@
         </w:rPr>
         <w:t xml:space="preserve">Ans: Link2: </w:t>
       </w:r>
-      <w:hyperlink w:history="1" r:id="rId5oknh8elxxpyjhnahq5l3">
+      <w:hyperlink w:history="1" r:id="rIdnfdothynjh0pakfmwflfj">
         <w:r>
           <w:rPr>
             <w:rStyle w:val="Hyperlink"/>
@@ -366,7 +366,7 @@
         </w:rPr>
         <w:t xml:space="preserve">Ans: Link3: </w:t>
       </w:r>
-      <w:hyperlink w:history="1" r:id="rIddsdtl3qjogqkt9jnwimsj">
+      <w:hyperlink w:history="1" r:id="rIdkodddkv1rqswpxirc0vu3">
         <w:r>
           <w:rPr>
             <w:rStyle w:val="Hyperlink"/>
@@ -394,7 +394,7 @@
       <w:r>
         <w:drawing>
           <wp:inline distT="0" distB="0" distL="0" distR="0">
-            <wp:extent cx="5715000" cy="2200275"/>
+            <wp:extent cx="5715000" cy="1781175"/>
             <wp:effectExtent t="0" r="0" b="0" l="0"/>
             <wp:docPr id="1" name="" descr="" title=""/>
             <wp:cNvGraphicFramePr>
@@ -419,7 +419,7 @@
                   <pic:spPr bwMode="auto">
                     <a:xfrm>
                       <a:off x="0" y="0"/>
-                      <a:ext cx="5715000" cy="2200275"/>
+                      <a:ext cx="5715000" cy="1781175"/>
                     </a:xfrm>
                     <a:prstGeom prst="rect">
                       <a:avLst/>
@@ -449,12 +449,44 @@
         <w:spacing w:after="200"/>
       </w:pPr>
       <w:r>
-        <w:rPr>
-          <w:i/>
-          <w:iCs/>
-          <w:color w:val="C00000"/>
-        </w:rPr>
-        <w:t xml:space="preserve">[Paste the Q3 EPWave screenshot here]</w:t>
+        <w:drawing>
+          <wp:inline distT="0" distB="0" distL="0" distR="0">
+            <wp:extent cx="5715000" cy="733425"/>
+            <wp:effectExtent t="0" r="0" b="0" l="0"/>
+            <wp:docPr id="1" name="" descr="" title=""/>
+            <wp:cNvGraphicFramePr>
+              <a:graphicFrameLocks xmlns:a="http://schemas.openxmlformats.org/drawingml/2006/main" noChangeAspect="1"/>
+            </wp:cNvGraphicFramePr>
+            <a:graphic xmlns:a="http://schemas.openxmlformats.org/drawingml/2006/main">
+              <a:graphicData uri="http://schemas.openxmlformats.org/drawingml/2006/picture">
+                <pic:pic xmlns:pic="http://schemas.openxmlformats.org/drawingml/2006/picture">
+                  <pic:nvPicPr>
+                    <pic:cNvPr id="0" name="" descr=""/>
+                    <pic:cNvPicPr>
+                      <a:picLocks noChangeAspect="1" noChangeArrowheads="1"/>
+                    </pic:cNvPicPr>
+                  </pic:nvPicPr>
+                  <pic:blipFill>
+                    <a:blip r:embed="rId12" cstate="none"/>
+                    <a:srcRect/>
+                    <a:stretch>
+                      <a:fillRect/>
+                    </a:stretch>
+                  </pic:blipFill>
+                  <pic:spPr bwMode="auto">
+                    <a:xfrm>
+                      <a:off x="0" y="0"/>
+                      <a:ext cx="5715000" cy="733425"/>
+                    </a:xfrm>
+                    <a:prstGeom prst="rect">
+                      <a:avLst/>
+                    </a:prstGeom>
+                  </pic:spPr>
+                </pic:pic>
+              </a:graphicData>
+            </a:graphic>
+          </wp:inline>
+        </w:drawing>
       </w:r>
     </w:p>
     <w:sectPr>

</xml_diff>

<commit_message>
Update Experiment 3 submission with name and new links
Co-Authored-By: Claude Opus 5.5 <noreply@anthropic.com>
Claude-Session: https://claude.ai/code/session_01AEpijYRL5yYf8piu39phkP
</commit_message>
<xml_diff>
--- a/exp3/Exp3_Assignment.docx
+++ b/exp3/Exp3_Assignment.docx
@@ -7,7 +7,7 @@
         <w:spacing w:after="240"/>
       </w:pPr>
       <w:r>
-        <w:t xml:space="preserve">Name &amp; ID:……………………………………Date: ……………………….</w:t>
+        <w:t xml:space="preserve">Name &amp; ID: Divit Kejriwal 2025A7PS0409U   Date: 17th September</w:t>
       </w:r>
     </w:p>
     <w:p>
@@ -62,12 +62,12 @@
         </w:rPr>
         <w:t xml:space="preserve">Ans: Link1: </w:t>
       </w:r>
-      <w:hyperlink w:history="1" r:id="rId0k5rpl7s_3bgtkkydgrry">
+      <w:hyperlink w:history="1" r:id="rIdwayarzrfvsof30yrqqtsi">
         <w:r>
           <w:rPr>
             <w:rStyle w:val="Hyperlink"/>
           </w:rPr>
-          <w:t xml:space="preserve">https://www.edaplayground.com/x/6SCX</w:t>
+          <w:t xml:space="preserve">https://edaplayground.com/x/q2AF</w:t>
         </w:r>
       </w:hyperlink>
     </w:p>
@@ -214,12 +214,12 @@
         </w:rPr>
         <w:t xml:space="preserve">Ans: Link2: </w:t>
       </w:r>
-      <w:hyperlink w:history="1" r:id="rIdnfdothynjh0pakfmwflfj">
+      <w:hyperlink w:history="1" r:id="rIdo9wpxk2pv194fhvideyru">
         <w:r>
           <w:rPr>
             <w:rStyle w:val="Hyperlink"/>
           </w:rPr>
-          <w:t xml:space="preserve">https://edaplayground.com/x/ZS8q</w:t>
+          <w:t xml:space="preserve">https://edaplayground.com/x/vQx7</w:t>
         </w:r>
       </w:hyperlink>
     </w:p>
@@ -366,12 +366,12 @@
         </w:rPr>
         <w:t xml:space="preserve">Ans: Link3: </w:t>
       </w:r>
-      <w:hyperlink w:history="1" r:id="rIdkodddkv1rqswpxirc0vu3">
+      <w:hyperlink w:history="1" r:id="rId4c3o6myajjnwfb4ogplrf">
         <w:r>
           <w:rPr>
             <w:rStyle w:val="Hyperlink"/>
           </w:rPr>
-          <w:t xml:space="preserve">https://edaplayground.com/x/pUNs</w:t>
+          <w:t xml:space="preserve">https://edaplayground.com/x/AkRc</w:t>
         </w:r>
       </w:hyperlink>
     </w:p>

</xml_diff>

<commit_message>
Replace Q2 code screenshot in Experiment 3 submission
Co-Authored-By: Claude Opus 5.5 <noreply@anthropic.com>
Claude-Session: https://claude.ai/code/session_01AEpijYRL5yYf8piu39phkP
</commit_message>
<xml_diff>
--- a/exp3/Exp3_Assignment.docx
+++ b/exp3/Exp3_Assignment.docx
@@ -62,7 +62,7 @@
         </w:rPr>
         <w:t xml:space="preserve">Ans: Link1: </w:t>
       </w:r>
-      <w:hyperlink w:history="1" r:id="rIdwayarzrfvsof30yrqqtsi">
+      <w:hyperlink w:history="1" r:id="rId5xoaxb5k-qo_7ou3dnydy">
         <w:r>
           <w:rPr>
             <w:rStyle w:val="Hyperlink"/>
@@ -214,7 +214,7 @@
         </w:rPr>
         <w:t xml:space="preserve">Ans: Link2: </w:t>
       </w:r>
-      <w:hyperlink w:history="1" r:id="rIdo9wpxk2pv194fhvideyru">
+      <w:hyperlink w:history="1" r:id="rIdaqxsk2f_ci9nhkbzkcmpx">
         <w:r>
           <w:rPr>
             <w:rStyle w:val="Hyperlink"/>
@@ -242,7 +242,7 @@
       <w:r>
         <w:drawing>
           <wp:inline distT="0" distB="0" distL="0" distR="0">
-            <wp:extent cx="5715000" cy="1171575"/>
+            <wp:extent cx="5715000" cy="1609725"/>
             <wp:effectExtent t="0" r="0" b="0" l="0"/>
             <wp:docPr id="1" name="" descr="" title=""/>
             <wp:cNvGraphicFramePr>
@@ -267,7 +267,7 @@
                   <pic:spPr bwMode="auto">
                     <a:xfrm>
                       <a:off x="0" y="0"/>
-                      <a:ext cx="5715000" cy="1171575"/>
+                      <a:ext cx="5715000" cy="1609725"/>
                     </a:xfrm>
                     <a:prstGeom prst="rect">
                       <a:avLst/>
@@ -366,7 +366,7 @@
         </w:rPr>
         <w:t xml:space="preserve">Ans: Link3: </w:t>
       </w:r>
-      <w:hyperlink w:history="1" r:id="rId4c3o6myajjnwfb4ogplrf">
+      <w:hyperlink w:history="1" r:id="rIdycc12qs0jpwndkqgz-hn6">
         <w:r>
           <w:rPr>
             <w:rStyle w:val="Hyperlink"/>

</xml_diff>

<commit_message>
Replace Q1 code screenshot in Experiment 3 submission
Co-Authored-By: Claude Opus 5.5 <noreply@anthropic.com>
Claude-Session: https://claude.ai/code/session_01AEpijYRL5yYf8piu39phkP
</commit_message>
<xml_diff>
--- a/exp3/Exp3_Assignment.docx
+++ b/exp3/Exp3_Assignment.docx
@@ -62,7 +62,7 @@
         </w:rPr>
         <w:t xml:space="preserve">Ans: Link1: </w:t>
       </w:r>
-      <w:hyperlink w:history="1" r:id="rId5xoaxb5k-qo_7ou3dnydy">
+      <w:hyperlink w:history="1" r:id="rIdotl22t09qncmwo9mwvqvh">
         <w:r>
           <w:rPr>
             <w:rStyle w:val="Hyperlink"/>
@@ -90,7 +90,7 @@
       <w:r>
         <w:drawing>
           <wp:inline distT="0" distB="0" distL="0" distR="0">
-            <wp:extent cx="5715000" cy="3695700"/>
+            <wp:extent cx="5715000" cy="1657350"/>
             <wp:effectExtent t="0" r="0" b="0" l="0"/>
             <wp:docPr id="1" name="" descr="" title=""/>
             <wp:cNvGraphicFramePr>
@@ -115,7 +115,7 @@
                   <pic:spPr bwMode="auto">
                     <a:xfrm>
                       <a:off x="0" y="0"/>
-                      <a:ext cx="5715000" cy="3695700"/>
+                      <a:ext cx="5715000" cy="1657350"/>
                     </a:xfrm>
                     <a:prstGeom prst="rect">
                       <a:avLst/>
@@ -214,7 +214,7 @@
         </w:rPr>
         <w:t xml:space="preserve">Ans: Link2: </w:t>
       </w:r>
-      <w:hyperlink w:history="1" r:id="rIdaqxsk2f_ci9nhkbzkcmpx">
+      <w:hyperlink w:history="1" r:id="rIddryxocnsnzjyjinr80idq">
         <w:r>
           <w:rPr>
             <w:rStyle w:val="Hyperlink"/>
@@ -366,7 +366,7 @@
         </w:rPr>
         <w:t xml:space="preserve">Ans: Link3: </w:t>
       </w:r>
-      <w:hyperlink w:history="1" r:id="rIdycc12qs0jpwndkqgz-hn6">
+      <w:hyperlink w:history="1" r:id="rIde0y3p7pd7aocn9glm9lxj">
         <w:r>
           <w:rPr>
             <w:rStyle w:val="Hyperlink"/>

</xml_diff>